<commit_message>
atividade atualização agenda 08
</commit_message>
<xml_diff>
--- a/Agenda 08/JoaoFlavioDiniz_Ag_08_DSI-II.docx
+++ b/Agenda 08/JoaoFlavioDiniz_Ag_08_DSI-II.docx
@@ -439,6 +439,11 @@
     </w:p>
     <w:p>
       <w:r>
+        <w:br w:type="page"/>
+      </w:r>
+    </w:p>
+    <w:p>
+      <w:r>
         <w:lastRenderedPageBreak/>
         <w:t xml:space="preserve">Depois desta mensagem, é exibida a tela inicial contida no arquivo </w:t>
       </w:r>
@@ -460,9 +465,9 @@
     <w:p>
       <w:r>
         <w:drawing>
-          <wp:inline distT="0" distB="0" distL="0" distR="0" wp14:anchorId="4C3D2BF5" wp14:editId="6C020E01">
-            <wp:extent cx="5400040" cy="2490470"/>
-            <wp:effectExtent l="0" t="0" r="0" b="5080"/>
+          <wp:inline distT="0" distB="0" distL="0" distR="0" wp14:anchorId="4C3D2BF5" wp14:editId="28A9B4DB">
+            <wp:extent cx="5138737" cy="2171700"/>
+            <wp:effectExtent l="0" t="0" r="5080" b="0"/>
             <wp:docPr id="1109475767" name="Imagem 1"/>
             <wp:cNvGraphicFramePr>
               <a:graphicFrameLocks xmlns:a="http://schemas.openxmlformats.org/drawingml/2006/main" noChangeAspect="1"/>
@@ -483,7 +488,7 @@
                   <pic:spPr>
                     <a:xfrm>
                       <a:off x="0" y="0"/>
-                      <a:ext cx="5400040" cy="2490470"/>
+                      <a:ext cx="5154831" cy="2178502"/>
                     </a:xfrm>
                     <a:prstGeom prst="rect">
                       <a:avLst/>
@@ -535,11 +540,10 @@
     </w:p>
     <w:p>
       <w:r>
-        <w:lastRenderedPageBreak/>
         <w:drawing>
-          <wp:inline distT="0" distB="0" distL="0" distR="0" wp14:anchorId="73720AE9" wp14:editId="73DA1C1D">
-            <wp:extent cx="5400040" cy="4622165"/>
-            <wp:effectExtent l="0" t="0" r="0" b="6985"/>
+          <wp:inline distT="0" distB="0" distL="0" distR="0" wp14:anchorId="73720AE9" wp14:editId="1CD0EF0C">
+            <wp:extent cx="5291137" cy="3974280"/>
+            <wp:effectExtent l="0" t="0" r="5080" b="7620"/>
             <wp:docPr id="1801216600" name="Imagem 1"/>
             <wp:cNvGraphicFramePr>
               <a:graphicFrameLocks xmlns:a="http://schemas.openxmlformats.org/drawingml/2006/main" noChangeAspect="1"/>
@@ -560,7 +564,7 @@
                   <pic:spPr>
                     <a:xfrm>
                       <a:off x="0" y="0"/>
-                      <a:ext cx="5400040" cy="4622165"/>
+                      <a:ext cx="5321711" cy="3997245"/>
                     </a:xfrm>
                     <a:prstGeom prst="rect">
                       <a:avLst/>
@@ -575,6 +579,7 @@
     </w:p>
     <w:p>
       <w:r>
+        <w:lastRenderedPageBreak/>
         <w:t xml:space="preserve">Na figura 05 acima podemos observar que recebemos o usuário e senha através do método POST e se a senha estiver certa, recebemos a menagem de </w:t>
       </w:r>
       <w:proofErr w:type="spellStart"/>
@@ -707,6 +712,681 @@
       </w:r>
       <w:r>
         <w:t>.</w:t>
+      </w:r>
+    </w:p>
+    <w:p>
+      <w:r>
+        <w:t xml:space="preserve">A figura 06 exibe o código da </w:t>
+      </w:r>
+      <w:proofErr w:type="gramStart"/>
+      <w:r>
+        <w:t>pagina</w:t>
+      </w:r>
+      <w:proofErr w:type="gramEnd"/>
+      <w:r>
+        <w:t xml:space="preserve"> inicial </w:t>
+      </w:r>
+      <w:proofErr w:type="spellStart"/>
+      <w:r>
+        <w:t>index.php</w:t>
+      </w:r>
+      <w:proofErr w:type="spellEnd"/>
+      <w:r>
+        <w:t xml:space="preserve"> onde percebe-se a inclusão do </w:t>
+      </w:r>
+      <w:proofErr w:type="spellStart"/>
+      <w:r>
+        <w:t>cabeçalho.php</w:t>
+      </w:r>
+      <w:proofErr w:type="spellEnd"/>
+      <w:r>
+        <w:t xml:space="preserve"> e do </w:t>
+      </w:r>
+      <w:proofErr w:type="spellStart"/>
+      <w:r>
+        <w:t>rodapé.php</w:t>
+      </w:r>
+      <w:proofErr w:type="spellEnd"/>
+      <w:r>
+        <w:t xml:space="preserve"> no início e fim da página.</w:t>
+      </w:r>
+    </w:p>
+    <w:p>
+      <w:r>
+        <w:drawing>
+          <wp:inline distT="0" distB="0" distL="0" distR="0" wp14:anchorId="55C81F84" wp14:editId="3FE3D11A">
+            <wp:extent cx="5738812" cy="2471927"/>
+            <wp:effectExtent l="0" t="0" r="0" b="5080"/>
+            <wp:docPr id="94980927" name="Imagem 1"/>
+            <wp:cNvGraphicFramePr>
+              <a:graphicFrameLocks xmlns:a="http://schemas.openxmlformats.org/drawingml/2006/main" noChangeAspect="1"/>
+            </wp:cNvGraphicFramePr>
+            <a:graphic xmlns:a="http://schemas.openxmlformats.org/drawingml/2006/main">
+              <a:graphicData uri="http://schemas.openxmlformats.org/drawingml/2006/picture">
+                <pic:pic xmlns:pic="http://schemas.openxmlformats.org/drawingml/2006/picture">
+                  <pic:nvPicPr>
+                    <pic:cNvPr id="94980927" name=""/>
+                    <pic:cNvPicPr/>
+                  </pic:nvPicPr>
+                  <pic:blipFill>
+                    <a:blip r:embed="rId11"/>
+                    <a:stretch>
+                      <a:fillRect/>
+                    </a:stretch>
+                  </pic:blipFill>
+                  <pic:spPr>
+                    <a:xfrm>
+                      <a:off x="0" y="0"/>
+                      <a:ext cx="5754674" cy="2478759"/>
+                    </a:xfrm>
+                    <a:prstGeom prst="rect">
+                      <a:avLst/>
+                    </a:prstGeom>
+                  </pic:spPr>
+                </pic:pic>
+              </a:graphicData>
+            </a:graphic>
+          </wp:inline>
+        </w:drawing>
+      </w:r>
+    </w:p>
+    <w:p>
+      <w:r>
+        <w:t xml:space="preserve">Para inserir </w:t>
+      </w:r>
+      <w:proofErr w:type="gramStart"/>
+      <w:r>
+        <w:t>uma novo amigo</w:t>
+      </w:r>
+      <w:proofErr w:type="gramEnd"/>
+      <w:r>
+        <w:t xml:space="preserve"> no banco de dados, basta clicar em adicionar na página inicial que o usuário será direcionado a página de cadastro. Na página de cadastro é onde inserimos os novos amigos, conforme mostra a </w:t>
+      </w:r>
+      <w:r>
+        <w:t>figura 07.</w:t>
+      </w:r>
+    </w:p>
+    <w:p/>
+    <w:p>
+      <w:r>
+        <w:drawing>
+          <wp:inline distT="0" distB="0" distL="0" distR="0" wp14:anchorId="4B64CD15" wp14:editId="5AFEFC0C">
+            <wp:extent cx="4919662" cy="2323302"/>
+            <wp:effectExtent l="0" t="0" r="0" b="1270"/>
+            <wp:docPr id="2070365548" name="Imagem 1"/>
+            <wp:cNvGraphicFramePr>
+              <a:graphicFrameLocks xmlns:a="http://schemas.openxmlformats.org/drawingml/2006/main" noChangeAspect="1"/>
+            </wp:cNvGraphicFramePr>
+            <a:graphic xmlns:a="http://schemas.openxmlformats.org/drawingml/2006/main">
+              <a:graphicData uri="http://schemas.openxmlformats.org/drawingml/2006/picture">
+                <pic:pic xmlns:pic="http://schemas.openxmlformats.org/drawingml/2006/picture">
+                  <pic:nvPicPr>
+                    <pic:cNvPr id="2070365548" name=""/>
+                    <pic:cNvPicPr/>
+                  </pic:nvPicPr>
+                  <pic:blipFill>
+                    <a:blip r:embed="rId12"/>
+                    <a:stretch>
+                      <a:fillRect/>
+                    </a:stretch>
+                  </pic:blipFill>
+                  <pic:spPr>
+                    <a:xfrm>
+                      <a:off x="0" y="0"/>
+                      <a:ext cx="4930728" cy="2328528"/>
+                    </a:xfrm>
+                    <a:prstGeom prst="rect">
+                      <a:avLst/>
+                    </a:prstGeom>
+                  </pic:spPr>
+                </pic:pic>
+              </a:graphicData>
+            </a:graphic>
+          </wp:inline>
+        </w:drawing>
+      </w:r>
+    </w:p>
+    <w:p>
+      <w:r>
+        <w:lastRenderedPageBreak/>
+        <w:t xml:space="preserve">Caso o cadastro seja </w:t>
+      </w:r>
+      <w:proofErr w:type="gramStart"/>
+      <w:r>
+        <w:t>bem sucedido</w:t>
+      </w:r>
+      <w:proofErr w:type="gramEnd"/>
+      <w:r>
+        <w:t xml:space="preserve">, o aplicativo </w:t>
+      </w:r>
+      <w:proofErr w:type="gramStart"/>
+      <w:r>
+        <w:t>ira</w:t>
+      </w:r>
+      <w:proofErr w:type="gramEnd"/>
+      <w:r>
+        <w:t xml:space="preserve"> devolver uma tela com a mensagem “Amigo salvo com sucesso!”, conforme figura 08</w:t>
+      </w:r>
+    </w:p>
+    <w:p>
+      <w:r>
+        <w:drawing>
+          <wp:inline distT="0" distB="0" distL="0" distR="0" wp14:anchorId="557388AC" wp14:editId="12501208">
+            <wp:extent cx="5400040" cy="2058035"/>
+            <wp:effectExtent l="0" t="0" r="0" b="0"/>
+            <wp:docPr id="975226362" name="Imagem 1"/>
+            <wp:cNvGraphicFramePr>
+              <a:graphicFrameLocks xmlns:a="http://schemas.openxmlformats.org/drawingml/2006/main" noChangeAspect="1"/>
+            </wp:cNvGraphicFramePr>
+            <a:graphic xmlns:a="http://schemas.openxmlformats.org/drawingml/2006/main">
+              <a:graphicData uri="http://schemas.openxmlformats.org/drawingml/2006/picture">
+                <pic:pic xmlns:pic="http://schemas.openxmlformats.org/drawingml/2006/picture">
+                  <pic:nvPicPr>
+                    <pic:cNvPr id="975226362" name=""/>
+                    <pic:cNvPicPr/>
+                  </pic:nvPicPr>
+                  <pic:blipFill>
+                    <a:blip r:embed="rId13"/>
+                    <a:stretch>
+                      <a:fillRect/>
+                    </a:stretch>
+                  </pic:blipFill>
+                  <pic:spPr>
+                    <a:xfrm>
+                      <a:off x="0" y="0"/>
+                      <a:ext cx="5400040" cy="2058035"/>
+                    </a:xfrm>
+                    <a:prstGeom prst="rect">
+                      <a:avLst/>
+                    </a:prstGeom>
+                  </pic:spPr>
+                </pic:pic>
+              </a:graphicData>
+            </a:graphic>
+          </wp:inline>
+        </w:drawing>
+      </w:r>
+    </w:p>
+    <w:p>
+      <w:r>
+        <w:t xml:space="preserve">Após clicar sobre a mensagem o usuário será direcionado para a </w:t>
+      </w:r>
+      <w:proofErr w:type="gramStart"/>
+      <w:r>
+        <w:t>pagina</w:t>
+      </w:r>
+      <w:proofErr w:type="gramEnd"/>
+      <w:r>
+        <w:t xml:space="preserve"> inicial novamente. Nesta tela podemos listar os amigos do usuário clicando no ícone </w:t>
+      </w:r>
+      <w:proofErr w:type="gramStart"/>
+      <w:r>
+        <w:t>de Listar</w:t>
+      </w:r>
+      <w:proofErr w:type="gramEnd"/>
+      <w:r>
+        <w:t>. A tela de listagem de amigos exibe os cadastros atuais conforme ilustra a figura 09 a seguir.</w:t>
+      </w:r>
+    </w:p>
+    <w:p>
+      <w:r>
+        <w:drawing>
+          <wp:inline distT="0" distB="0" distL="0" distR="0" wp14:anchorId="427B5250" wp14:editId="7AF3162D">
+            <wp:extent cx="5400040" cy="1559560"/>
+            <wp:effectExtent l="0" t="0" r="0" b="2540"/>
+            <wp:docPr id="1380392203" name="Imagem 1"/>
+            <wp:cNvGraphicFramePr>
+              <a:graphicFrameLocks xmlns:a="http://schemas.openxmlformats.org/drawingml/2006/main" noChangeAspect="1"/>
+            </wp:cNvGraphicFramePr>
+            <a:graphic xmlns:a="http://schemas.openxmlformats.org/drawingml/2006/main">
+              <a:graphicData uri="http://schemas.openxmlformats.org/drawingml/2006/picture">
+                <pic:pic xmlns:pic="http://schemas.openxmlformats.org/drawingml/2006/picture">
+                  <pic:nvPicPr>
+                    <pic:cNvPr id="1380392203" name=""/>
+                    <pic:cNvPicPr/>
+                  </pic:nvPicPr>
+                  <pic:blipFill>
+                    <a:blip r:embed="rId14"/>
+                    <a:stretch>
+                      <a:fillRect/>
+                    </a:stretch>
+                  </pic:blipFill>
+                  <pic:spPr>
+                    <a:xfrm>
+                      <a:off x="0" y="0"/>
+                      <a:ext cx="5400040" cy="1559560"/>
+                    </a:xfrm>
+                    <a:prstGeom prst="rect">
+                      <a:avLst/>
+                    </a:prstGeom>
+                  </pic:spPr>
+                </pic:pic>
+              </a:graphicData>
+            </a:graphic>
+          </wp:inline>
+        </w:drawing>
+      </w:r>
+    </w:p>
+    <w:p>
+      <w:r>
+        <w:t xml:space="preserve">A correção ou atualização pode ser feita clicando-se no ícone de atualizar. Ao clicar no ícone de atualizar o usuário será direcionado para a página de cadastro já preenchida com as informações que queremos fazer, </w:t>
+      </w:r>
+      <w:r>
+        <w:t xml:space="preserve">depois de feitas as alterações, basta clicar em atualizar, </w:t>
+      </w:r>
+      <w:r>
+        <w:t>conforme figura 10.</w:t>
+      </w:r>
+    </w:p>
+    <w:p>
+      <w:r>
+        <w:drawing>
+          <wp:inline distT="0" distB="0" distL="0" distR="0" wp14:anchorId="333F6CD8" wp14:editId="32231C66">
+            <wp:extent cx="5400040" cy="2475230"/>
+            <wp:effectExtent l="0" t="0" r="0" b="1270"/>
+            <wp:docPr id="1807398003" name="Imagem 1"/>
+            <wp:cNvGraphicFramePr>
+              <a:graphicFrameLocks xmlns:a="http://schemas.openxmlformats.org/drawingml/2006/main" noChangeAspect="1"/>
+            </wp:cNvGraphicFramePr>
+            <a:graphic xmlns:a="http://schemas.openxmlformats.org/drawingml/2006/main">
+              <a:graphicData uri="http://schemas.openxmlformats.org/drawingml/2006/picture">
+                <pic:pic xmlns:pic="http://schemas.openxmlformats.org/drawingml/2006/picture">
+                  <pic:nvPicPr>
+                    <pic:cNvPr id="1807398003" name=""/>
+                    <pic:cNvPicPr/>
+                  </pic:nvPicPr>
+                  <pic:blipFill>
+                    <a:blip r:embed="rId15"/>
+                    <a:stretch>
+                      <a:fillRect/>
+                    </a:stretch>
+                  </pic:blipFill>
+                  <pic:spPr>
+                    <a:xfrm>
+                      <a:off x="0" y="0"/>
+                      <a:ext cx="5400040" cy="2475230"/>
+                    </a:xfrm>
+                    <a:prstGeom prst="rect">
+                      <a:avLst/>
+                    </a:prstGeom>
+                  </pic:spPr>
+                </pic:pic>
+              </a:graphicData>
+            </a:graphic>
+          </wp:inline>
+        </w:drawing>
+      </w:r>
+    </w:p>
+    <w:p>
+      <w:r>
+        <w:lastRenderedPageBreak/>
+        <w:t>Uma mensagem “Amigo atualizado com sucesso!” será novamente exibida conforme a figura 11.</w:t>
+      </w:r>
+    </w:p>
+    <w:p>
+      <w:r>
+        <w:drawing>
+          <wp:inline distT="0" distB="0" distL="0" distR="0" wp14:anchorId="1386749B" wp14:editId="68994AE4">
+            <wp:extent cx="5400040" cy="2002790"/>
+            <wp:effectExtent l="0" t="0" r="0" b="0"/>
+            <wp:docPr id="39518163" name="Imagem 1"/>
+            <wp:cNvGraphicFramePr>
+              <a:graphicFrameLocks xmlns:a="http://schemas.openxmlformats.org/drawingml/2006/main" noChangeAspect="1"/>
+            </wp:cNvGraphicFramePr>
+            <a:graphic xmlns:a="http://schemas.openxmlformats.org/drawingml/2006/main">
+              <a:graphicData uri="http://schemas.openxmlformats.org/drawingml/2006/picture">
+                <pic:pic xmlns:pic="http://schemas.openxmlformats.org/drawingml/2006/picture">
+                  <pic:nvPicPr>
+                    <pic:cNvPr id="39518163" name=""/>
+                    <pic:cNvPicPr/>
+                  </pic:nvPicPr>
+                  <pic:blipFill>
+                    <a:blip r:embed="rId16"/>
+                    <a:stretch>
+                      <a:fillRect/>
+                    </a:stretch>
+                  </pic:blipFill>
+                  <pic:spPr>
+                    <a:xfrm>
+                      <a:off x="0" y="0"/>
+                      <a:ext cx="5400040" cy="2002790"/>
+                    </a:xfrm>
+                    <a:prstGeom prst="rect">
+                      <a:avLst/>
+                    </a:prstGeom>
+                  </pic:spPr>
+                </pic:pic>
+              </a:graphicData>
+            </a:graphic>
+          </wp:inline>
+        </w:drawing>
+      </w:r>
+    </w:p>
+    <w:p>
+      <w:r>
+        <w:t xml:space="preserve">Depois de clicar sobre a mensagem, o </w:t>
+      </w:r>
+      <w:proofErr w:type="gramStart"/>
+      <w:r>
+        <w:t>usuário  é</w:t>
+      </w:r>
+      <w:proofErr w:type="gramEnd"/>
+      <w:r>
+        <w:t xml:space="preserve"> direcionado para a página de listagem de amigo, onde pode-se observar as alterações realizadas </w:t>
+      </w:r>
+      <w:proofErr w:type="gramStart"/>
+      <w:r>
+        <w:t>nos cadastro</w:t>
+      </w:r>
+      <w:proofErr w:type="gramEnd"/>
+      <w:r>
+        <w:t xml:space="preserve"> conforme ilustra a figura 12 a seguir.</w:t>
+      </w:r>
+    </w:p>
+    <w:p>
+      <w:r>
+        <w:drawing>
+          <wp:inline distT="0" distB="0" distL="0" distR="0" wp14:anchorId="50D7D966" wp14:editId="27184E89">
+            <wp:extent cx="5400040" cy="1358265"/>
+            <wp:effectExtent l="0" t="0" r="0" b="0"/>
+            <wp:docPr id="1249595591" name="Imagem 1"/>
+            <wp:cNvGraphicFramePr>
+              <a:graphicFrameLocks xmlns:a="http://schemas.openxmlformats.org/drawingml/2006/main" noChangeAspect="1"/>
+            </wp:cNvGraphicFramePr>
+            <a:graphic xmlns:a="http://schemas.openxmlformats.org/drawingml/2006/main">
+              <a:graphicData uri="http://schemas.openxmlformats.org/drawingml/2006/picture">
+                <pic:pic xmlns:pic="http://schemas.openxmlformats.org/drawingml/2006/picture">
+                  <pic:nvPicPr>
+                    <pic:cNvPr id="1249595591" name=""/>
+                    <pic:cNvPicPr/>
+                  </pic:nvPicPr>
+                  <pic:blipFill>
+                    <a:blip r:embed="rId17"/>
+                    <a:stretch>
+                      <a:fillRect/>
+                    </a:stretch>
+                  </pic:blipFill>
+                  <pic:spPr>
+                    <a:xfrm>
+                      <a:off x="0" y="0"/>
+                      <a:ext cx="5400040" cy="1358265"/>
+                    </a:xfrm>
+                    <a:prstGeom prst="rect">
+                      <a:avLst/>
+                    </a:prstGeom>
+                  </pic:spPr>
+                </pic:pic>
+              </a:graphicData>
+            </a:graphic>
+          </wp:inline>
+        </w:drawing>
+      </w:r>
+    </w:p>
+    <w:p>
+      <w:r>
+        <w:t xml:space="preserve">Se por acaso o usuário precisar apagar algum registro por algum motivo, basta clicar sobre o ícone de excluir do registro desejado, neste caso, a página de exclusão apresentará uma alerta na parte superior informando cancelar a exclusão caso o usuário tenha </w:t>
+      </w:r>
+      <w:proofErr w:type="gramStart"/>
+      <w:r>
+        <w:t>clicando</w:t>
+      </w:r>
+      <w:proofErr w:type="gramEnd"/>
+      <w:r>
+        <w:t xml:space="preserve"> por engano no ícone. Mas se a intenção era excluir o cadastro, então é só “</w:t>
+      </w:r>
+      <w:r>
+        <w:tab/>
+        <w:t>confirmar a exclusão” conforme figura 13.</w:t>
+      </w:r>
+    </w:p>
+    <w:p>
+      <w:r>
+        <w:drawing>
+          <wp:inline distT="0" distB="0" distL="0" distR="0" wp14:anchorId="22CDAAE7" wp14:editId="6B02EADD">
+            <wp:extent cx="5400040" cy="2435860"/>
+            <wp:effectExtent l="0" t="0" r="0" b="2540"/>
+            <wp:docPr id="1303074360" name="Imagem 1"/>
+            <wp:cNvGraphicFramePr>
+              <a:graphicFrameLocks xmlns:a="http://schemas.openxmlformats.org/drawingml/2006/main" noChangeAspect="1"/>
+            </wp:cNvGraphicFramePr>
+            <a:graphic xmlns:a="http://schemas.openxmlformats.org/drawingml/2006/main">
+              <a:graphicData uri="http://schemas.openxmlformats.org/drawingml/2006/picture">
+                <pic:pic xmlns:pic="http://schemas.openxmlformats.org/drawingml/2006/picture">
+                  <pic:nvPicPr>
+                    <pic:cNvPr id="1303074360" name=""/>
+                    <pic:cNvPicPr/>
+                  </pic:nvPicPr>
+                  <pic:blipFill>
+                    <a:blip r:embed="rId18"/>
+                    <a:stretch>
+                      <a:fillRect/>
+                    </a:stretch>
+                  </pic:blipFill>
+                  <pic:spPr>
+                    <a:xfrm>
+                      <a:off x="0" y="0"/>
+                      <a:ext cx="5400040" cy="2435860"/>
+                    </a:xfrm>
+                    <a:prstGeom prst="rect">
+                      <a:avLst/>
+                    </a:prstGeom>
+                  </pic:spPr>
+                </pic:pic>
+              </a:graphicData>
+            </a:graphic>
+          </wp:inline>
+        </w:drawing>
+      </w:r>
+    </w:p>
+    <w:p>
+      <w:r>
+        <w:lastRenderedPageBreak/>
+        <w:t>Depois de clicar no ícone de confirmar a exclusão o usuário verá a página de confirmação de exclusão com a mensagem “Amigo excluído com sucesso!”</w:t>
+      </w:r>
+    </w:p>
+    <w:p>
+      <w:r>
+        <w:t>Conforme mostra a figura 14.</w:t>
+      </w:r>
+    </w:p>
+    <w:p>
+      <w:r>
+        <w:drawing>
+          <wp:inline distT="0" distB="0" distL="0" distR="0" wp14:anchorId="6938D070" wp14:editId="653462C5">
+            <wp:extent cx="5400040" cy="1896745"/>
+            <wp:effectExtent l="0" t="0" r="0" b="8255"/>
+            <wp:docPr id="1230922091" name="Imagem 1"/>
+            <wp:cNvGraphicFramePr>
+              <a:graphicFrameLocks xmlns:a="http://schemas.openxmlformats.org/drawingml/2006/main" noChangeAspect="1"/>
+            </wp:cNvGraphicFramePr>
+            <a:graphic xmlns:a="http://schemas.openxmlformats.org/drawingml/2006/main">
+              <a:graphicData uri="http://schemas.openxmlformats.org/drawingml/2006/picture">
+                <pic:pic xmlns:pic="http://schemas.openxmlformats.org/drawingml/2006/picture">
+                  <pic:nvPicPr>
+                    <pic:cNvPr id="1230922091" name=""/>
+                    <pic:cNvPicPr/>
+                  </pic:nvPicPr>
+                  <pic:blipFill>
+                    <a:blip r:embed="rId19"/>
+                    <a:stretch>
+                      <a:fillRect/>
+                    </a:stretch>
+                  </pic:blipFill>
+                  <pic:spPr>
+                    <a:xfrm>
+                      <a:off x="0" y="0"/>
+                      <a:ext cx="5400040" cy="1896745"/>
+                    </a:xfrm>
+                    <a:prstGeom prst="rect">
+                      <a:avLst/>
+                    </a:prstGeom>
+                  </pic:spPr>
+                </pic:pic>
+              </a:graphicData>
+            </a:graphic>
+          </wp:inline>
+        </w:drawing>
+      </w:r>
+    </w:p>
+    <w:p>
+      <w:r>
+        <w:t>Após clicar na mensagem de sucesso, o usuário será direcionado a página de</w:t>
+      </w:r>
+      <w:r>
+        <w:t xml:space="preserve"> listagem de amigo novamente para confirmar a exclusão conforme a figura 15 ilustra.</w:t>
+      </w:r>
+    </w:p>
+    <w:p>
+      <w:r>
+        <w:rPr>
+          <w:noProof/>
+        </w:rPr>
+        <mc:AlternateContent>
+          <mc:Choice Requires="wps">
+            <w:drawing>
+              <wp:anchor distT="0" distB="0" distL="114300" distR="114300" simplePos="0" relativeHeight="251659264" behindDoc="0" locked="0" layoutInCell="1" allowOverlap="1" wp14:anchorId="5EA86A62" wp14:editId="771866A2">
+                <wp:simplePos x="0" y="0"/>
+                <wp:positionH relativeFrom="column">
+                  <wp:posOffset>291465</wp:posOffset>
+                </wp:positionH>
+                <wp:positionV relativeFrom="paragraph">
+                  <wp:posOffset>209550</wp:posOffset>
+                </wp:positionV>
+                <wp:extent cx="295275" cy="0"/>
+                <wp:effectExtent l="38100" t="76200" r="0" b="95250"/>
+                <wp:wrapNone/>
+                <wp:docPr id="1423094754" name="Conexão reta unidirecional 3"/>
+                <wp:cNvGraphicFramePr/>
+                <a:graphic xmlns:a="http://schemas.openxmlformats.org/drawingml/2006/main">
+                  <a:graphicData uri="http://schemas.microsoft.com/office/word/2010/wordprocessingShape">
+                    <wps:wsp>
+                      <wps:cNvCnPr/>
+                      <wps:spPr>
+                        <a:xfrm flipH="1">
+                          <a:off x="0" y="0"/>
+                          <a:ext cx="295275" cy="0"/>
+                        </a:xfrm>
+                        <a:prstGeom prst="straightConnector1">
+                          <a:avLst/>
+                        </a:prstGeom>
+                        <a:ln>
+                          <a:tailEnd type="triangle"/>
+                        </a:ln>
+                      </wps:spPr>
+                      <wps:style>
+                        <a:lnRef idx="2">
+                          <a:schemeClr val="accent1"/>
+                        </a:lnRef>
+                        <a:fillRef idx="0">
+                          <a:schemeClr val="accent1"/>
+                        </a:fillRef>
+                        <a:effectRef idx="1">
+                          <a:schemeClr val="accent1"/>
+                        </a:effectRef>
+                        <a:fontRef idx="minor">
+                          <a:schemeClr val="tx1"/>
+                        </a:fontRef>
+                      </wps:style>
+                      <wps:bodyPr/>
+                    </wps:wsp>
+                  </a:graphicData>
+                </a:graphic>
+              </wp:anchor>
+            </w:drawing>
+          </mc:Choice>
+          <mc:Fallback>
+            <w:pict>
+              <v:shapetype w14:anchorId="2EE4B23D" id="_x0000_t32" coordsize="21600,21600" o:spt="32" o:oned="t" path="m,l21600,21600e" filled="f">
+                <v:path arrowok="t" fillok="f" o:connecttype="none"/>
+                <o:lock v:ext="edit" shapetype="t"/>
+              </v:shapetype>
+              <v:shape id="Conexão reta unidirecional 3" o:spid="_x0000_s1026" type="#_x0000_t32" style="position:absolute;margin-left:22.95pt;margin-top:16.5pt;width:23.25pt;height:0;flip:x;z-index:251659264;visibility:visible;mso-wrap-style:square;mso-wrap-distance-left:9pt;mso-wrap-distance-top:0;mso-wrap-distance-right:9pt;mso-wrap-distance-bottom:0;mso-position-horizontal:absolute;mso-position-horizontal-relative:text;mso-position-vertical:absolute;mso-position-vertical-relative:text" o:gfxdata="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" strokecolor="#156082 [3204]" strokeweight="1.5pt">
+                <v:stroke endarrow="block" joinstyle="miter"/>
+              </v:shape>
+            </w:pict>
+          </mc:Fallback>
+        </mc:AlternateContent>
+      </w:r>
+      <w:r>
+        <w:drawing>
+          <wp:inline distT="0" distB="0" distL="0" distR="0" wp14:anchorId="1AD3326E" wp14:editId="42860B21">
+            <wp:extent cx="5400040" cy="1346835"/>
+            <wp:effectExtent l="0" t="0" r="0" b="5715"/>
+            <wp:docPr id="1102485212" name="Imagem 1"/>
+            <wp:cNvGraphicFramePr>
+              <a:graphicFrameLocks xmlns:a="http://schemas.openxmlformats.org/drawingml/2006/main" noChangeAspect="1"/>
+            </wp:cNvGraphicFramePr>
+            <a:graphic xmlns:a="http://schemas.openxmlformats.org/drawingml/2006/main">
+              <a:graphicData uri="http://schemas.openxmlformats.org/drawingml/2006/picture">
+                <pic:pic xmlns:pic="http://schemas.openxmlformats.org/drawingml/2006/picture">
+                  <pic:nvPicPr>
+                    <pic:cNvPr id="1102485212" name=""/>
+                    <pic:cNvPicPr/>
+                  </pic:nvPicPr>
+                  <pic:blipFill>
+                    <a:blip r:embed="rId20"/>
+                    <a:stretch>
+                      <a:fillRect/>
+                    </a:stretch>
+                  </pic:blipFill>
+                  <pic:spPr>
+                    <a:xfrm>
+                      <a:off x="0" y="0"/>
+                      <a:ext cx="5400040" cy="1346835"/>
+                    </a:xfrm>
+                    <a:prstGeom prst="rect">
+                      <a:avLst/>
+                    </a:prstGeom>
+                  </pic:spPr>
+                </pic:pic>
+              </a:graphicData>
+            </a:graphic>
+          </wp:inline>
+        </w:drawing>
+      </w:r>
+    </w:p>
+    <w:p>
+      <w:r>
+        <w:t>Se não for mais alterar ou excluir algum cadastro, o usuário pode voltar a página inicial clicando na seta superior esquerda da figura 15, que ele será direcionado novamente a página inicial, de onde o usuário pode alterar, excluir, apagar ou cadastrar amigos, ou efetuar o logout clicando no ícone de logout no canto superior direto conforme figura 16.</w:t>
+      </w:r>
+    </w:p>
+    <w:p>
+      <w:r>
+        <w:drawing>
+          <wp:inline distT="0" distB="0" distL="0" distR="0" wp14:anchorId="65096672" wp14:editId="0BE47ECA">
+            <wp:extent cx="5400040" cy="2280285"/>
+            <wp:effectExtent l="0" t="0" r="0" b="5715"/>
+            <wp:docPr id="151276033" name="Imagem 1"/>
+            <wp:cNvGraphicFramePr>
+              <a:graphicFrameLocks xmlns:a="http://schemas.openxmlformats.org/drawingml/2006/main" noChangeAspect="1"/>
+            </wp:cNvGraphicFramePr>
+            <a:graphic xmlns:a="http://schemas.openxmlformats.org/drawingml/2006/main">
+              <a:graphicData uri="http://schemas.openxmlformats.org/drawingml/2006/picture">
+                <pic:pic xmlns:pic="http://schemas.openxmlformats.org/drawingml/2006/picture">
+                  <pic:nvPicPr>
+                    <pic:cNvPr id="151276033" name=""/>
+                    <pic:cNvPicPr/>
+                  </pic:nvPicPr>
+                  <pic:blipFill>
+                    <a:blip r:embed="rId21"/>
+                    <a:stretch>
+                      <a:fillRect/>
+                    </a:stretch>
+                  </pic:blipFill>
+                  <pic:spPr>
+                    <a:xfrm>
+                      <a:off x="0" y="0"/>
+                      <a:ext cx="5400040" cy="2280285"/>
+                    </a:xfrm>
+                    <a:prstGeom prst="rect">
+                      <a:avLst/>
+                    </a:prstGeom>
+                  </pic:spPr>
+                </pic:pic>
+              </a:graphicData>
+            </a:graphic>
+          </wp:inline>
+        </w:drawing>
       </w:r>
     </w:p>
     <w:p/>

</xml_diff>